<commit_message>
docs(refs): corriger DOI kadoma+ejigu, ajouter 2 sources fine-tuning, section 8.4 RQ2
</commit_message>
<xml_diff>
--- a/Topic2_Thesis_Final.docx
+++ b/Topic2_Thesis_Final.docx
@@ -14804,6 +14804,18 @@
         <w:rPr>
           <w:b/>
         </w:rPr>
+        <w:t xml:space="preserve">Domain-specific fine-tuning rather than prompting alone. </w:t>
+      </w:r>
+      <w:r>
+        <w:rPr/>
+        <w:t xml:space="preserve">The original project brief envisaged transfer learning and domain-specific fine-tuning as a route to higher accuracy on organisation-specific vocabulary; this thesis deliberately limited itself to prompt-based domain adaptation, since fine-tuning a Whisper or wav2vec 2.0 checkpoint was impractical within the project's CPU-only, no-GPU sandbox and, more fundamentally, no labelled in-domain Nestlé corpus was available. Two recent directions are nonetheless worth recording as the natural next step, because both specifically target the data-scarcity constraint that blocked this work. Text-only fine-tuning adapts a speech-language-model ASR system to a target domain using only target-domain text, with no labelled in-domain audio at all (Fang et al., 2025); this is directly applicable to the Nestlé setting, where meeting recordings are confidential but written minutes, reports, and brand glossaries are readily available. A complementary decoupled two-stage approach first applies parameter-efficient LoRA fine-tuning of the language component on target-domain text, then adapts the acoustic encoder on unlabelled in-domain audio via pseudo-labelling, reporting a 19.2% relative word-error-rate reduction without any labelled in-domain audio pairs (Zheng et al., 2026). Both are parameter-efficient and could realistically be run on the GPU hardware noted below, making domain-adaptive fine-tuning the most concrete and highest-value extension of this work, and the one that most directly answers the adaptation question posed in the original research brief.</w:t>
+      </w:r>
+    </w:p>
+    <w:p>
+      <w:r>
+        <w:rPr>
+          <w:b/>
+        </w:rPr>
         <w:t>GPU acceleration of the evaluation pipeline.</w:t>
       </w:r>
       <w:r>
@@ -15561,7 +15573,7 @@
           <w:i w:val="false"/>
           <w:iCs w:val="false"/>
         </w:rPr>
-        <w:t xml:space="preserve">Ejigu, Y. A., Asfaw, T. T., &amp; Tadesse, S. A. (2025). A noise-robust end-to-end framework for Amharic speech recognition [Preprint]. https://doi.org/10.21203/rs.3.rs-6419413/v1</w:t>
+        <w:t>Ejigu, Y. A., Asfaw, T. T., &amp; Tadesse, S. A. (2026). A Noise-Robust End-to-End Framework for Amharic Speech Recognition. International Journal of Speech Technology, 29(14). https://doi.org/10.1007/s10772-025-10224-x</w:t>
       </w:r>
     </w:p>
     <w:p>
@@ -15577,6 +15589,22 @@
           <w:i w:val="false"/>
           <w:iCs w:val="false"/>
         </w:rPr>
+        <w:t xml:space="preserve">Fang, Y., Peng, J., Li, X., Xi, Y., Zhang, C., Zhong, G., &amp; Yu, K. (2025). Low-Resource Domain Adaptation for Speech LLMs via Text-Only Fine-Tuning. arXiv preprint arXiv:2506.05671.</w:t>
+      </w:r>
+    </w:p>
+    <w:p>
+      <w:pPr>
+        <w:spacing w:after="110" w:line="252" w:lineRule="auto"/>
+        <w:jc w:val="both"/>
+      </w:pPr>
+      <w:r>
+        <w:rPr>
+          <w:rFonts w:ascii="Times New Roman" w:cs="Times New Roman" w:eastAsia="Times New Roman" w:hAnsi="Times New Roman"/>
+          <w:b w:val="false"/>
+          <w:bCs w:val="false"/>
+          <w:i w:val="false"/>
+          <w:iCs w:val="false"/>
+        </w:rPr>
         <w:t xml:space="preserve">Farahani, G. (2017). Autocorrelation-based noise subtraction method with smoothing, overestimation, energy, and cepstral mean and variance normalization for noisy speech recognition. </w:t>
       </w:r>
       <w:r>
@@ -15757,7 +15785,7 @@
           <w:i w:val="false"/>
           <w:iCs w:val="false"/>
         </w:rPr>
-        <w:t xml:space="preserve">Kadoma, K., Shrivastava, P., &amp; Naaman, M. (2026). Lost in transcription: Subtitle errors in automatic speech recognition reduce speaker and content evaluations. In </w:t>
+        <w:t>Kadoma, K., Shrivastava, P., &amp; Naaman, M. (2026). Lost in transcription: Subtitle errors in automatic speech recognition reduce speaker and content evaluations. In Proceedings of the ACM CHI Conference on Human Factors in Computing Systems. https://doi.org/10.1145/3772318.3790911</w:t>
       </w:r>
       <w:r>
         <w:rPr>
@@ -15767,17 +15795,15 @@
           <w:i/>
           <w:iCs/>
         </w:rPr>
-        <w:t xml:space="preserve">Proceedings of the ACM CHI Conference on Human Factors in Computing Systems</w:t>
-      </w:r>
-      <w:r>
-        <w:rPr>
-          <w:rFonts w:ascii="Times New Roman" w:cs="Times New Roman" w:eastAsia="Times New Roman" w:hAnsi="Times New Roman"/>
-          <w:b w:val="false"/>
-          <w:bCs w:val="false"/>
-          <w:i w:val="false"/>
-          <w:iCs w:val="false"/>
-        </w:rPr>
-        <w:t xml:space="preserve">.</w:t>
+      </w:r>
+      <w:r>
+        <w:rPr>
+          <w:rFonts w:ascii="Times New Roman" w:cs="Times New Roman" w:eastAsia="Times New Roman" w:hAnsi="Times New Roman"/>
+          <w:b w:val="false"/>
+          <w:bCs w:val="false"/>
+          <w:i w:val="false"/>
+          <w:iCs w:val="false"/>
+        </w:rPr>
       </w:r>
     </w:p>
     <w:p>
@@ -16426,6 +16452,22 @@
           <w:iCs w:val="false"/>
         </w:rPr>
         <w:t xml:space="preserve"> (pp. 276–283). IEEE.</w:t>
+      </w:r>
+    </w:p>
+    <w:p>
+      <w:pPr>
+        <w:spacing w:after="110" w:line="252" w:lineRule="auto"/>
+        <w:jc w:val="both"/>
+      </w:pPr>
+      <w:r>
+        <w:rPr>
+          <w:rFonts w:ascii="Times New Roman" w:cs="Times New Roman" w:eastAsia="Times New Roman" w:hAnsi="Times New Roman"/>
+          <w:b w:val="false"/>
+          <w:bCs w:val="false"/>
+          <w:i w:val="false"/>
+          <w:iCs w:val="false"/>
+        </w:rPr>
+        <w:t xml:space="preserve">Zheng, L., Wang, X., Zhao, Q., &amp; Li, T. (2026). Two-Stage Domain Adaptation for LLM-Based ASR by Decoupling Linguistic and Acoustic Factors. Applied Sciences, 16(1), 60. https://doi.org/10.3390/app16010060</w:t>
       </w:r>
     </w:p>
     <w:p>

</xml_diff>

<commit_message>
style(these): remplacer les tirets cadratins, corriger DOI refs, section 8.4 RQ2
</commit_message>
<xml_diff>
--- a/Topic2_Thesis_Final.docx
+++ b/Topic2_Thesis_Final.docx
@@ -1263,7 +1263,7 @@
           <w:sz w:val="18"/>
           <w:szCs w:val="18"/>
         </w:rPr>
-        <w:t xml:space="preserve">6.2 RQ1 / H1 — Noise and the Effect of Noise-Reduction Preprocessing</w:t>
+        <w:t>6.2 RQ1 / H1, Noise and the Effect of Noise-Reduction Preprocessing</w:t>
       </w:r>
       <w:r>
         <w:rPr>
@@ -1293,7 +1293,7 @@
           <w:sz w:val="18"/>
           <w:szCs w:val="18"/>
         </w:rPr>
-        <w:t xml:space="preserve">6.3 RQ2 / H2 — Domain Vocabulary Prompting</w:t>
+        <w:t>6.3 RQ2 / H2, Domain Vocabulary Prompting</w:t>
       </w:r>
       <w:r>
         <w:rPr>
@@ -1323,7 +1323,7 @@
           <w:sz w:val="18"/>
           <w:szCs w:val="18"/>
         </w:rPr>
-        <w:t xml:space="preserve">6.4 RQ3 / H4 — Reliability of Automatic Language Identification</w:t>
+        <w:t>6.4 RQ3 / H4, Reliability of Automatic Language Identification</w:t>
       </w:r>
       <w:r>
         <w:rPr>
@@ -1353,7 +1353,7 @@
           <w:sz w:val="18"/>
           <w:szCs w:val="18"/>
         </w:rPr>
-        <w:t xml:space="preserve">6.5 RQ4 / H3 — Model Size, Accuracy, and Real-Time Factor</w:t>
+        <w:t>6.5 RQ4 / H3, Model Size, Accuracy, and Real-Time Factor</w:t>
       </w:r>
       <w:r>
         <w:rPr>
@@ -1767,7 +1767,7 @@
           <w:sz w:val="20"/>
           <w:szCs w:val="20"/>
         </w:rPr>
-        <w:t xml:space="preserve">Appendix C: Architecture — As Built and Planned Migration</w:t>
+        <w:t>Appendix C: Architecture, As Built and Planned Migration</w:t>
       </w:r>
       <w:r>
         <w:rPr>
@@ -6075,7 +6075,7 @@
           <w:i w:val="false"/>
           <w:iCs w:val="false"/>
         </w:rPr>
-        <w:t xml:space="preserve">Table 5.1 — Evaluation samples by language and noise condition</w:t>
+        <w:t>Table 5.1: Evaluation samples by language and noise condition</w:t>
       </w:r>
     </w:p>
     <w:tbl>
@@ -7552,7 +7552,7 @@
           <w:i w:val="false"/>
           <w:iCs w:val="false"/>
         </w:rPr>
-        <w:t xml:space="preserve">Table 5.2 — Experimental conditions (n=36 samples per condition, 180 runs total)</w:t>
+        <w:t>Table 5.2: Experimental conditions (n=36 samples per condition, 180 runs total)</w:t>
       </w:r>
     </w:p>
     <w:tbl>
@@ -7792,7 +7792,7 @@
                 <w:sz w:val="20"/>
                 <w:szCs w:val="20"/>
               </w:rPr>
-              <w:t xml:space="preserve">A — Baseline</w:t>
+              <w:t>A, Baseline</w:t>
             </w:r>
           </w:p>
         </w:tc>
@@ -7974,7 +7974,7 @@
                 <w:sz w:val="20"/>
                 <w:szCs w:val="20"/>
               </w:rPr>
-              <w:t xml:space="preserve">B — Noise reduction</w:t>
+              <w:t>B, Noise reduction</w:t>
             </w:r>
           </w:p>
         </w:tc>
@@ -8156,7 +8156,7 @@
                 <w:sz w:val="20"/>
                 <w:szCs w:val="20"/>
               </w:rPr>
-              <w:t xml:space="preserve">D — Domain prompt</w:t>
+              <w:t>D, Domain prompt</w:t>
             </w:r>
           </w:p>
         </w:tc>
@@ -8338,7 +8338,7 @@
                 <w:sz w:val="20"/>
                 <w:szCs w:val="20"/>
               </w:rPr>
-              <w:t xml:space="preserve">E — Forced language</w:t>
+              <w:t>E, Forced language</w:t>
             </w:r>
           </w:p>
         </w:tc>
@@ -8520,7 +8520,7 @@
                 <w:sz w:val="20"/>
                 <w:szCs w:val="20"/>
               </w:rPr>
-              <w:t xml:space="preserve">F — Base model</w:t>
+              <w:t>F, Base model</w:t>
             </w:r>
           </w:p>
         </w:tc>
@@ -9609,7 +9609,7 @@
           <w:i w:val="false"/>
           <w:iCs w:val="false"/>
         </w:rPr>
-        <w:t xml:space="preserve">Table 6.1 — Aggregate results by condition (n=36 per condition)</w:t>
+        <w:t>Table 6.1: Aggregate results by condition (n=36 per condition)</w:t>
       </w:r>
     </w:p>
     <w:tbl>
@@ -9849,7 +9849,7 @@
                 <w:sz w:val="20"/>
                 <w:szCs w:val="20"/>
               </w:rPr>
-              <w:t xml:space="preserve">A — Baseline</w:t>
+              <w:t>A, Baseline</w:t>
             </w:r>
           </w:p>
         </w:tc>
@@ -10031,7 +10031,7 @@
                 <w:sz w:val="20"/>
                 <w:szCs w:val="20"/>
               </w:rPr>
-              <w:t xml:space="preserve">B — Noise reduction</w:t>
+              <w:t>B, Noise reduction</w:t>
             </w:r>
           </w:p>
         </w:tc>
@@ -10213,7 +10213,7 @@
                 <w:sz w:val="20"/>
                 <w:szCs w:val="20"/>
               </w:rPr>
-              <w:t xml:space="preserve">D — Domain prompt</w:t>
+              <w:t>D, Domain prompt</w:t>
             </w:r>
           </w:p>
         </w:tc>
@@ -10395,7 +10395,7 @@
                 <w:sz w:val="20"/>
                 <w:szCs w:val="20"/>
               </w:rPr>
-              <w:t xml:space="preserve">E — Forced language</w:t>
+              <w:t>E, Forced language</w:t>
             </w:r>
           </w:p>
         </w:tc>
@@ -10577,7 +10577,7 @@
                 <w:sz w:val="20"/>
                 <w:szCs w:val="20"/>
               </w:rPr>
-              <w:t xml:space="preserve">F — Base model</w:t>
+              <w:t>F, Base model</w:t>
             </w:r>
           </w:p>
         </w:tc>
@@ -10810,7 +10810,7 @@
           <w:i w:val="false"/>
           <w:iCs w:val="false"/>
         </w:rPr>
-        <w:t xml:space="preserve">Table 6.2 — Mean WER and CER by noise condition (n=24 clean / 12 noisy per condition)</w:t>
+        <w:t>Table 6.2: Mean WER and CER by noise condition (n=24 clean / 12 noisy per condition)</w:t>
       </w:r>
     </w:p>
     <w:tbl>
@@ -11050,7 +11050,7 @@
                 <w:sz w:val="20"/>
                 <w:szCs w:val="20"/>
               </w:rPr>
-              <w:t xml:space="preserve">A — Baseline</w:t>
+              <w:t>A, Baseline</w:t>
             </w:r>
           </w:p>
         </w:tc>
@@ -11232,7 +11232,7 @@
                 <w:sz w:val="20"/>
                 <w:szCs w:val="20"/>
               </w:rPr>
-              <w:t xml:space="preserve">B — Noise reduction</w:t>
+              <w:t>B, Noise reduction</w:t>
             </w:r>
           </w:p>
         </w:tc>
@@ -11414,7 +11414,7 @@
                 <w:sz w:val="20"/>
                 <w:szCs w:val="20"/>
               </w:rPr>
-              <w:t xml:space="preserve">D — Domain prompt</w:t>
+              <w:t>D, Domain prompt</w:t>
             </w:r>
           </w:p>
         </w:tc>
@@ -11596,7 +11596,7 @@
                 <w:sz w:val="20"/>
                 <w:szCs w:val="20"/>
               </w:rPr>
-              <w:t xml:space="preserve">E — Forced language</w:t>
+              <w:t>E, Forced language</w:t>
             </w:r>
           </w:p>
         </w:tc>
@@ -11778,7 +11778,7 @@
                 <w:sz w:val="20"/>
                 <w:szCs w:val="20"/>
               </w:rPr>
-              <w:t xml:space="preserve">F — Base model</w:t>
+              <w:t>F, Base model</w:t>
             </w:r>
           </w:p>
         </w:tc>
@@ -11964,7 +11964,7 @@
           <w:i w:val="false"/>
           <w:iCs w:val="false"/>
         </w:rPr>
-        <w:t xml:space="preserve">6.2 RQ1 / H1 — Noise and the Effect of Noise-Reduction Preprocessing</w:t>
+        <w:t>6.2 RQ1 / H1, Noise and the Effect of Noise-Reduction Preprocessing</w:t>
       </w:r>
     </w:p>
     <w:p>
@@ -12034,7 +12034,7 @@
           <w:i w:val="false"/>
           <w:iCs w:val="false"/>
         </w:rPr>
-        <w:t xml:space="preserve">6.3 RQ2 / H2 — Domain Vocabulary Prompting</w:t>
+        <w:t>6.3 RQ2 / H2, Domain Vocabulary Prompting</w:t>
       </w:r>
     </w:p>
     <w:p>
@@ -12104,7 +12104,7 @@
           <w:i w:val="false"/>
           <w:iCs w:val="false"/>
         </w:rPr>
-        <w:t xml:space="preserve">6.4 RQ3 / H4 — Reliability of Automatic Language Identification</w:t>
+        <w:t>6.4 RQ3 / H4, Reliability of Automatic Language Identification</w:t>
       </w:r>
     </w:p>
     <w:p>
@@ -12175,7 +12175,7 @@
           <w:i w:val="false"/>
           <w:iCs w:val="false"/>
         </w:rPr>
-        <w:t xml:space="preserve">Table 6.3 — Mean WER by language (n=12 per language per condition)</w:t>
+        <w:t>Table 6.3: Mean WER by language (n=12 per language per condition)</w:t>
       </w:r>
     </w:p>
     <w:tbl>
@@ -12378,7 +12378,7 @@
                 <w:sz w:val="20"/>
                 <w:szCs w:val="20"/>
               </w:rPr>
-              <w:t xml:space="preserve">A — Baseline</w:t>
+              <w:t>A, Baseline</w:t>
             </w:r>
           </w:p>
         </w:tc>
@@ -12524,7 +12524,7 @@
                 <w:sz w:val="20"/>
                 <w:szCs w:val="20"/>
               </w:rPr>
-              <w:t xml:space="preserve">B — Noise reduction</w:t>
+              <w:t>B, Noise reduction</w:t>
             </w:r>
           </w:p>
         </w:tc>
@@ -12670,7 +12670,7 @@
                 <w:sz w:val="20"/>
                 <w:szCs w:val="20"/>
               </w:rPr>
-              <w:t xml:space="preserve">D — Domain prompt</w:t>
+              <w:t>D, Domain prompt</w:t>
             </w:r>
           </w:p>
         </w:tc>
@@ -12816,7 +12816,7 @@
                 <w:sz w:val="20"/>
                 <w:szCs w:val="20"/>
               </w:rPr>
-              <w:t xml:space="preserve">E — Forced language</w:t>
+              <w:t>E, Forced language</w:t>
             </w:r>
           </w:p>
         </w:tc>
@@ -12962,7 +12962,7 @@
                 <w:sz w:val="20"/>
                 <w:szCs w:val="20"/>
               </w:rPr>
-              <w:t xml:space="preserve">F — Base model</w:t>
+              <w:t>F, Base model</w:t>
             </w:r>
           </w:p>
         </w:tc>
@@ -13112,7 +13112,7 @@
           <w:i w:val="false"/>
           <w:iCs w:val="false"/>
         </w:rPr>
-        <w:t xml:space="preserve">6.5 RQ4 / H3 — Model Size, Accuracy, and Real-Time Factor</w:t>
+        <w:t>6.5 RQ4 / H3, Model Size, Accuracy, and Real-Time Factor</w:t>
       </w:r>
     </w:p>
     <w:p>
@@ -14902,7 +14902,7 @@
           </w:tcPr>
           <w:p>
             <w:r>
-              <w:t>A — Baseline (tiny)</w:t>
+              <w:t>A, Baseline (tiny)</w:t>
             </w:r>
           </w:p>
         </w:tc>
@@ -14944,7 +14944,7 @@
           </w:tcPr>
           <w:p>
             <w:r>
-              <w:t>B — Noise reduction (tiny)</w:t>
+              <w:t>B, Noise reduction (tiny)</w:t>
             </w:r>
           </w:p>
         </w:tc>
@@ -14986,7 +14986,7 @@
           </w:tcPr>
           <w:p>
             <w:r>
-              <w:t>D — Domain prompt (tiny)</w:t>
+              <w:t>D, Domain prompt (tiny)</w:t>
             </w:r>
           </w:p>
         </w:tc>
@@ -15028,7 +15028,7 @@
           </w:tcPr>
           <w:p>
             <w:r>
-              <w:t>E — Forced language (tiny)</w:t>
+              <w:t>E, Forced language (tiny)</w:t>
             </w:r>
           </w:p>
         </w:tc>
@@ -15070,7 +15070,7 @@
           </w:tcPr>
           <w:p>
             <w:r>
-              <w:t>F — Base model (base)</w:t>
+              <w:t>F, Base model (base)</w:t>
             </w:r>
           </w:p>
         </w:tc>
@@ -18435,7 +18435,7 @@
           <w:i w:val="false"/>
           <w:iCs w:val="false"/>
         </w:rPr>
-        <w:t xml:space="preserve"> is 1 for all 36 rows without exception, because the underlying source material — PolyAI/MInDS-14 — consists of single-speaker telephone-banking utterances rather than multi-party meeting recordings; the column exists in the schema for forward compatibility with multi-speaker samples but carries no variation in the present dataset, a limitation already discussed in Section 5.4. Third, there is no speaker-identity field, no hearing-impairment or accessibility flag, and no enterprise identity-provider linkage (Azure Entra ID, Microsoft Graph, or otherwise) anywhere in this schema or in the code that consumes it. An earlier draft of this work described a JSON-schema metadata system with exactly these fields, modelled on an enterprise speaker-mapping and accessibility-tracking scheme; no such system was built, and the six-column CSV above is the complete, actual metadata structure used to produce every result reported in Chapter 6 and this appendix.</w:t>
+        <w:t xml:space="preserve"> is 1 for all 36 rows without exception, because the underlying source material, PolyAI/MInDS-14, consists of single-speaker telephone-banking utterances rather than multi-party meeting recordings; the column exists in the schema for forward compatibility with multi-speaker samples but carries no variation in the present dataset, a limitation already discussed in Section 5.4. Third, there is no speaker-identity field, no hearing-impairment or accessibility flag, and no enterprise identity-provider linkage (Azure Entra ID, Microsoft Graph, or otherwise) anywhere in this schema or in the code that consumes it. An earlier draft of this work described a JSON-schema metadata system with exactly these fields, modelled on an enterprise speaker-mapping and accessibility-tracking scheme; no such system was built, and the six-column CSV above is the complete, actual metadata structure used to produce every result reported in Chapter 6 and this appendix.</w:t>
       </w:r>
     </w:p>
     <w:p>
@@ -18516,7 +18516,7 @@
           <w:i w:val="false"/>
           <w:iCs w:val="false"/>
         </w:rPr>
-        <w:t xml:space="preserve"> — Accepts a multipart file upload plus an optional </w:t>
+        <w:t xml:space="preserve">, Accepts a multipart file upload plus an optional </w:t>
       </w:r>
       <w:r>
         <w:rPr>
@@ -18680,7 +18680,7 @@
           <w:i w:val="false"/>
           <w:iCs w:val="false"/>
         </w:rPr>
-        <w:t xml:space="preserve"> — A WebSocket endpoint serving the live transcription path described in Section 4.3 (</w:t>
+        <w:t>, A WebSocket endpoint serving the live transcription path described in Section 4.3 (</w:t>
       </w:r>
       <w:r>
         <w:rPr>
@@ -18798,7 +18798,7 @@
           <w:i w:val="false"/>
           <w:iCs w:val="false"/>
         </w:rPr>
-        <w:t xml:space="preserve"> — Accepts an image or scanned-document upload and returns extracted text per page, ingesting the result into the same ChromaDB collection as </w:t>
+        <w:t xml:space="preserve">, Accepts an image or scanned-document upload and returns extracted text per page, ingesting the result into the same ChromaDB collection as </w:t>
       </w:r>
       <w:r>
         <w:rPr>
@@ -18870,7 +18870,7 @@
           <w:i w:val="false"/>
           <w:iCs w:val="false"/>
         </w:rPr>
-        <w:t xml:space="preserve"> — Accepts a JSON body containing a natural-language question. Retrieves the top five most similar chunks (</w:t>
+        <w:t>, Accepts a JSON body containing a natural-language question. Retrieves the top five most similar chunks (</w:t>
       </w:r>
       <w:r>
         <w:rPr>
@@ -18965,7 +18965,7 @@
           <w:i w:val="false"/>
           <w:iCs w:val="false"/>
         </w:rPr>
-        <w:t xml:space="preserve"> — Returns a JSON object with </w:t>
+        <w:t xml:space="preserve">, Returns a JSON object with </w:t>
       </w:r>
       <w:r>
         <w:rPr>
@@ -19241,7 +19241,7 @@
           <w:i w:val="false"/>
           <w:iCs w:val="false"/>
         </w:rPr>
-        <w:t xml:space="preserve"> — Serve the static HTML front ends for the batch-upload and live-transcription pages respectively, via </w:t>
+        <w:t xml:space="preserve">, Serve the static HTML front ends for the batch-upload and live-transcription pages respectively, via </w:t>
       </w:r>
       <w:r>
         <w:rPr>
@@ -19444,7 +19444,7 @@
           <w:i w:val="false"/>
           <w:iCs w:val="false"/>
         </w:rPr>
-        <w:t xml:space="preserve">Appendix C: Architecture — As Built and Planned Migration</w:t>
+        <w:t>Appendix C: Architecture, As Built and Planned Migration</w:t>
       </w:r>
     </w:p>
     <w:p>
@@ -19984,7 +19984,7 @@
           <w:i w:val="false"/>
           <w:iCs w:val="false"/>
         </w:rPr>
-        <w:t xml:space="preserve">D.1 Condition A — Baseline (faster-whisper `tiny`, no preprocessing, no domain prompt, auto language detection).</w:t>
+        <w:t>D.1 Condition A, Baseline (faster-whisper `tiny`, no preprocessing, no domain prompt, auto language detection).</w:t>
       </w:r>
       <w:r>
         <w:rPr>
@@ -20069,7 +20069,7 @@
           <w:i w:val="false"/>
           <w:iCs w:val="false"/>
         </w:rPr>
-        <w:t xml:space="preserve"> Not evaluated as a precision/recall table. The dataset described in Appendix A contains no Nestlé-specific terminology — it is general-purpose telephone-banking speech — so no named-entity recognition rate against domain vocabulary could be measured. What was measured instead, and is the real, relevant finding in this area, is the prompt-leakage effect documented in Section 6.3: enabling </w:t>
+        <w:t xml:space="preserve"> Not evaluated as a precision/recall table. The dataset described in Appendix A contains no Nestlé-specific terminology, it is general-purpose telephone-banking speech, so no named-entity recognition rate against domain vocabulary could be measured. What was measured instead, and is the real, relevant finding in this area, is the prompt-leakage effect documented in Section 6.3: enabling </w:t>
       </w:r>
       <w:r>
         <w:rPr>
@@ -20118,7 +20118,7 @@
           <w:i w:val="false"/>
           <w:iCs w:val="false"/>
         </w:rPr>
-        <w:t xml:space="preserve"> Partially evaluated. This pilot tested exactly one synthetic noise condition — additive white noise at 8dB SNR — not the 25dB/15dB/5dB three-level sweep the original draft's D.4 table described. Real results for this single noise level, broken down by language and by condition, are reported in Table 6.2. A multi-level SNR sweep is listed as future work in Section 8.4 rather than reported here with invented intermediate values.</w:t>
+        <w:t xml:space="preserve"> Partially evaluated. This pilot tested exactly one synthetic noise condition, additive white noise at 8dB SNR, not the 25dB/15dB/5dB three-level sweep the original draft's D.4 table described. Real results for this single noise level, broken down by language and by condition, are reported in Table 6.2. A multi-level SNR sweep is listed as future work in Section 8.4 rather than reported here with invented intermediate values.</w:t>
       </w:r>
     </w:p>
     <w:p>
@@ -20193,7 +20193,7 @@
           <w:i w:val="false"/>
           <w:iCs w:val="false"/>
         </w:rPr>
-        <w:t xml:space="preserve"> Evaluated, using the same three languages already reported in Table 6.3 (English, French, German) — the real per-language WER and CER breakdown from the pilot. The original draft's D.6 table additionally included a row for unspecified "Local West African languages," for which no data, model, or evaluation of any kind exists in this project; that row is removed rather than carried forward as a placeholder.</w:t>
+        <w:t xml:space="preserve"> Evaluated, using the same three languages already reported in Table 6.3 (English, French, German), the real per-language WER and CER breakdown from the pilot. The original draft's D.6 table additionally included a row for unspecified "Local West African languages," for which no data, model, or evaluation of any kind exists in this project; that row is removed rather than carried forward as a placeholder.</w:t>
       </w:r>
     </w:p>
     <w:p>
@@ -20320,7 +20320,7 @@
           <w:i w:val="false"/>
           <w:iCs w:val="false"/>
         </w:rPr>
-        <w:t xml:space="preserve">) uses a separate, slightly different inline string containing the same core brand list but omitting "Nestlé Ghana" — an inconsistency documented as a real architectural gap in Section 4.3, not as a deliberate experimental variable.</w:t>
+        <w:t>) uses a separate, slightly different inline string containing the same core brand list but omitting "Nestlé Ghana", an inconsistency documented as a real architectural gap in Section 4.3, not as a deliberate experimental variable.</w:t>
       </w:r>
     </w:p>
     <w:p>
@@ -20336,7 +20336,7 @@
           <w:i w:val="false"/>
           <w:iCs w:val="false"/>
         </w:rPr>
-        <w:t xml:space="preserve">The actual, measured effect of this prompt on this dataset, reported in full in Section 6.3, was negative: because the 36 evaluation samples contain no Nestlé-related content (they are general-purpose telephone-banking utterances drawn from PolyAI/MInDS-14), the domain prompt's vocabulary had nothing relevant to anchor to, and instead biased decoding toward prompt-list terms. The clearest documented instance is a hypothesis transcript in which Whisper inserted the phrase "Nestlé Ghana" into output text where the corresponding reference transcript contains no such term — a direct, file-level example of prompt-induced hallucination, traceable to a specific row in </w:t>
+        <w:t xml:space="preserve">The actual, measured effect of this prompt on this dataset, reported in full in Section 6.3, was negative: because the 36 evaluation samples contain no Nestlé-related content (they are general-purpose telephone-banking utterances drawn from PolyAI/MInDS-14), the domain prompt's vocabulary had nothing relevant to anchor to, and instead biased decoding toward prompt-list terms. The clearest documented instance is a hypothesis transcript in which Whisper inserted the phrase "Nestlé Ghana" into output text where the corresponding reference transcript contains no such term, a direct, file-level example of prompt-induced hallucination, traceable to a specific row in </w:t>
       </w:r>
       <w:r>
         <w:rPr>
@@ -20375,7 +20375,7 @@
           <w:i w:val="false"/>
           <w:iCs w:val="false"/>
         </w:rPr>
-        <w:t xml:space="preserve">This finding necessarily replaces an earlier draft's treatment of this topic, which built an extended narrative around invented example terms — "Nescafé Gold," "Maggi Cube," "Milo Activ-Go," a "Maggi Fortification" initiative, and a "Projet Milo" — and an anecdote in which the system was claimed to have corrected a mistranscription of a named individual's surname, "Philippe Navratil," from an ASR error rendering it as "Philippe Naruto," with the claim qualified as "(experiment in progress; results to be reported)." No such individual, recording, or experiment exists in this project's actual materials; the anecdote is not retained in any form here, including as a qualified or hedged claim, because no evidence for it exists. The honest, supportable finding — that domain-vocabulary prompting hurt accuracy on a domain-mismatched evaluation set, with one concrete hallucination example traceable to raw results data — is presented in its place. Constructing or obtaining a small evaluation set that actually contains Nestlé-relevant vocabulary, so that the benefit side of domain-prompting (rather than only its cost) could finally be measured, is listed as future work in Section 8.4.</w:t>
+        <w:t>This finding necessarily replaces an earlier draft's treatment of this topic, which built an extended narrative around invented example terms, "Nescafé Gold," "Maggi Cube," "Milo Activ-Go," a "Maggi Fortification" initiative, and a "Projet Milo", and an anecdote in which the system was claimed to have corrected a mistranscription of a named individual's surname, "Philippe Navratil," from an ASR error rendering it as "Philippe Naruto," with the claim qualified as "(experiment in progress; results to be reported)." No such individual, recording, or experiment exists in this project's actual materials; the anecdote is not retained in any form here, including as a qualified or hedged claim, because no evidence for it exists. The honest, supportable finding, that domain-vocabulary prompting hurt accuracy on a domain-mismatched evaluation set, with one concrete hallucination example traceable to raw results data, is presented in its place. Constructing or obtaining a small evaluation set that actually contains Nestlé-relevant vocabulary, so that the benefit side of domain-prompting (rather than only its cost) could finally be measured, is listed as future work in Section 8.4.</w:t>
       </w:r>
     </w:p>
     <w:p>
@@ -20407,7 +20407,7 @@
           <w:i w:val="false"/>
           <w:iCs w:val="false"/>
         </w:rPr>
-        <w:t xml:space="preserve">Generative AI tools were used in the preparation of this thesis in the following ways, stated here as specifically as can be verified rather than in general terms. An AI assistant was used to help draft and revise prose throughout the document, working from the author's prior coursework, the project codebase, and the real evaluation data described in Chapters 5 and 6. The 180-run pilot evaluation itself — sample selection, the five experimental conditions, execution against the </w:t>
+        <w:t xml:space="preserve">Generative AI tools were used in the preparation of this thesis in the following ways, stated here as specifically as can be verified rather than in general terms. An AI assistant was used to help draft and revise prose throughout the document, working from the author's prior coursework, the project codebase, and the real evaluation data described in Chapters 5 and 6. The 180-run pilot evaluation itself, sample selection, the five experimental conditions, execution against the </w:t>
       </w:r>
       <w:r>
         <w:rPr>
@@ -20430,7 +20430,7 @@
           <w:i w:val="false"/>
           <w:iCs w:val="false"/>
         </w:rPr>
-        <w:t xml:space="preserve">-based pipeline, and computation of WER, CER, and real-time-factor metrics — was carried out using the project's own evaluation harness (</w:t>
+        <w:t>-based pipeline, and computation of WER, CER, and real-time-factor metrics, was carried out using the project's own evaluation harness (</w:t>
       </w:r>
       <w:r>
         <w:rPr>
@@ -20515,7 +20515,7 @@
           <w:i w:val="false"/>
           <w:iCs w:val="false"/>
         </w:rPr>
-        <w:t xml:space="preserve">This acknowledgment also serves to correct a materially false claim made in an earlier draft of this thesis, which stated that the system "was validated using real corporate meeting recordings." It was not: the evaluation corpus is PolyAI/MInDS-14 (Gerz et al., 2021), a publicly available, CC-BY-4.0-licensed dataset of single-speaker telephone-banking utterances, not corporate meeting audio of any kind, and this substitution and its implications for external validity are discussed honestly in Section 5.4 rather than concealed. The earlier draft also described, in this appendix and elsewhere, a fully deployed Azure enterprise stack — Azure AI Speech, Azure AI Search, Azure Blob Storage, Microsoft Entra ID, Azure Key Vault, and Microsoft Graph/Teams integration — as though it had been built and validated. None of it was; the actual Phase 2 status, a single unimplemented code stub, is documented honestly in Appendix C. Both corrections are made here explicitly, rather than by silent omission, in keeping with the academic-integrity standard applied to every claim in this rewrite: every figure, architectural description, and dataset characterisation in this document is either drawn from the real pilot results, drawn from direct inspection of the project's own codebase, drawn from accurately cited published literature, or explicitly labelled as a limitation, gap, or unverified observation.</w:t>
+        <w:t>This acknowledgment also serves to correct a materially false claim made in an earlier draft of this thesis, which stated that the system "was validated using real corporate meeting recordings." It was not: the evaluation corpus is PolyAI/MInDS-14 (Gerz et al., 2021), a publicly available, CC-BY-4.0-licensed dataset of single-speaker telephone-banking utterances, not corporate meeting audio of any kind, and this substitution and its implications for external validity are discussed honestly in Section 5.4 rather than concealed. The earlier draft also described, in this appendix and elsewhere, a fully deployed Azure enterprise stack, Azure AI Speech, Azure AI Search, Azure Blob Storage, Microsoft Entra ID, Azure Key Vault, and Microsoft Graph/Teams integration, as though it had been built and validated. None of it was; the actual Phase 2 status, a single unimplemented code stub, is documented honestly in Appendix C. Both corrections are made here explicitly, rather than by silent omission, in keeping with the academic-integrity standard applied to every claim in this rewrite: every figure, architectural description, and dataset characterisation in this document is either drawn from the real pilot results, drawn from direct inspection of the project's own codebase, drawn from accurately cited published literature, or explicitly labelled as a limitation, gap, or unverified observation.</w:t>
       </w:r>
     </w:p>
     <w:sectPr>

</xml_diff>